<commit_message>
modified checklist for releases
</commit_message>
<xml_diff>
--- a/Documentation/Checklist_Release_VECTO_3.1.0.652.docx
+++ b/Documentation/Checklist_Release_VECTO_3.1.0.652.docx
@@ -282,8 +282,8 @@
               </w:rPr>
               <w:fldChar w:fldCharType="separate"/>
             </w:r>
-            <w:bookmarkStart w:id="0" w:name="OLE_LINK3"/>
-            <w:bookmarkStart w:id="1" w:name="OLE_LINK4"/>
+            <w:bookmarkStart w:id="0" w:name="OLE_LINK4"/>
+            <w:bookmarkStart w:id="1" w:name="OLE_LINK3"/>
             <w:r>
               <w:rPr>
                 <w:rFonts w:ascii="Arial" w:hAnsi="Arial" w:cs="Arial"/>
@@ -2134,8 +2134,8 @@
               </w:rPr>
               <w:fldChar w:fldCharType="separate"/>
             </w:r>
-            <w:bookmarkStart w:id="11" w:name="OLE_LINK5"/>
-            <w:bookmarkStart w:id="12" w:name="OLE_LINK6"/>
+            <w:bookmarkStart w:id="11" w:name="OLE_LINK6"/>
+            <w:bookmarkStart w:id="12" w:name="OLE_LINK5"/>
             <w:r>
               <w:rPr>
                 <w:rFonts w:ascii="Arial" w:hAnsi="Arial" w:cs="Arial"/>
@@ -4735,7 +4735,7 @@
             </w:rPr>
             <w:id w:val="-867984556"/>
             <w14:checkbox>
-              <w14:checked w14:val="0"/>
+              <w14:checked w14:val="1"/>
               <w14:checkedState w14:val="2612" w14:font="MS Gothic"/>
               <w14:uncheckedState w14:val="2610" w14:font="MS Gothic"/>
             </w14:checkbox>
@@ -4757,7 +4757,7 @@
                   <w:rPr>
                     <w:rFonts w:ascii="MS Gothic" w:eastAsia="MS Gothic" w:hAnsi="MS Gothic" w:cs="Arial" w:hint="eastAsia"/>
                   </w:rPr>
-                  <w:t>☐</w:t>
+                  <w:t>☒</w:t>
                 </w:r>
               </w:p>
             </w:tc>
@@ -4812,40 +4812,10 @@
                 <w:noProof/>
                 <w:lang w:val="de-AT"/>
               </w:rPr>
-              <w:t> </w:t>
-            </w:r>
-            <w:r>
-              <w:rPr>
-                <w:rFonts w:ascii="Arial" w:hAnsi="Arial" w:cs="Arial"/>
-                <w:noProof/>
-                <w:lang w:val="de-AT"/>
-              </w:rPr>
-              <w:t> </w:t>
-            </w:r>
-            <w:r>
-              <w:rPr>
-                <w:rFonts w:ascii="Arial" w:hAnsi="Arial" w:cs="Arial"/>
-                <w:noProof/>
-                <w:lang w:val="de-AT"/>
-              </w:rPr>
-              <w:t> </w:t>
-            </w:r>
-            <w:r>
-              <w:rPr>
-                <w:rFonts w:ascii="Arial" w:hAnsi="Arial" w:cs="Arial"/>
-                <w:noProof/>
-                <w:lang w:val="de-AT"/>
-              </w:rPr>
-              <w:t> </w:t>
-            </w:r>
-            <w:r>
-              <w:rPr>
-                <w:rFonts w:ascii="Arial" w:hAnsi="Arial" w:cs="Arial"/>
-                <w:noProof/>
-                <w:lang w:val="de-AT"/>
-              </w:rPr>
-              <w:t> </w:t>
-            </w:r>
+              <w:t>quam</w:t>
+            </w:r>
+            <w:bookmarkStart w:id="13" w:name="_GoBack"/>
+            <w:bookmarkEnd w:id="13"/>
             <w:r>
               <w:rPr>
                 <w:rFonts w:ascii="Arial" w:hAnsi="Arial" w:cs="Arial"/>
@@ -5042,7 +5012,7 @@
           </w:ffData>
         </w:fldChar>
       </w:r>
-      <w:bookmarkStart w:id="13" w:name="Text4"/>
+      <w:bookmarkStart w:id="14" w:name="Text4"/>
       <w:r>
         <w:rPr>
           <w:sz w:val="24"/>
@@ -5073,7 +5043,7 @@
         </w:rPr>
         <w:fldChar w:fldCharType="end"/>
       </w:r>
-      <w:bookmarkEnd w:id="13"/>
+      <w:bookmarkEnd w:id="14"/>
     </w:p>
     <w:p>
       <w:pPr>
@@ -5109,7 +5079,7 @@
           </w:ffData>
         </w:fldChar>
       </w:r>
-      <w:bookmarkStart w:id="14" w:name="Text5"/>
+      <w:bookmarkStart w:id="15" w:name="Text5"/>
       <w:r>
         <w:rPr>
           <w:sz w:val="24"/>
@@ -5134,15 +5104,13 @@
         </w:rPr>
         <w:t>quam</w:t>
       </w:r>
-      <w:bookmarkStart w:id="15" w:name="_GoBack"/>
-      <w:bookmarkEnd w:id="15"/>
       <w:r>
         <w:rPr>
           <w:sz w:val="24"/>
         </w:rPr>
         <w:fldChar w:fldCharType="end"/>
       </w:r>
-      <w:bookmarkEnd w:id="14"/>
+      <w:bookmarkEnd w:id="15"/>
     </w:p>
     <w:sectPr>
       <w:pgSz w:w="12240" w:h="15840"/>

</xml_diff>